<commit_message>
INS-302 v1.1: new Ch 9 ongoing administration (annual levy, delinquency standing, 53321(d)/53325.3 protections, prepayment quotes); chapters renumbered; both editions rebuilt, margin gate passed; delivery package refreshed; rev 46
</commit_message>
<xml_diff>
--- a/02_PROGRAM/INS-302_Developer_Guide.docx
+++ b/02_PROGRAM/INS-302_Developer_Guide.docx
@@ -2,7 +2,7 @@
 <file path=word/document.xml><?xml version="1.0" encoding="utf-8"?>
 <w:document xmlns:w="http://schemas.openxmlformats.org/wordprocessingml/2006/main" xmlns:m="http://schemas.openxmlformats.org/officeDocument/2006/math" xmlns:r="http://schemas.openxmlformats.org/officeDocument/2006/relationships" xmlns:o="urn:schemas-microsoft-com:office:office" xmlns:v="urn:schemas-microsoft-com:vml" xmlns:w10="urn:schemas-microsoft-com:office:word" xmlns:a="http://schemas.openxmlformats.org/drawingml/2006/main" xmlns:pic="http://schemas.openxmlformats.org/drawingml/2006/picture" xmlns:wp="http://schemas.openxmlformats.org/drawingml/2006/wordprocessingDrawing">
   <w:body>
-    <w:bookmarkStart w:id="30" w:name="ins-302-the-insite-developer-guide"/>
+    <w:bookmarkStart w:id="31" w:name="ins-302-the-insite-developer-guide"/>
     <w:p>
       <w:pPr>
         <w:pStyle w:val="Heading1"/>
@@ -20,7 +20,7 @@
           <w:bCs/>
           <w:b/>
         </w:rPr>
-        <w:t xml:space="preserve">Version 1.0, July 12, 2026. One document for the builder: eligibility, the application, underwriting, approval, funding, construction, and the questions everyone asks. This guide consolidates the intake manual (INS-202), the data package checklist (INS-201), the appraisal manual (INS-101), and the transaction execution manual (INS-401); those remain the controlling documents where detail matters.</w:t>
+        <w:t xml:space="preserve">Version 1.1, July 18, 2026. One document for the builder: eligibility, the application, underwriting, approval, funding, construction, the annual levy, and the questions everyone asks. This guide consolidates the intake manual (INS-202), the data package checklist (INS-201), the appraisal manual (INS-101), and the transaction execution manual (INS-401); those remain the controlling documents where detail matters.</w:t>
       </w:r>
     </w:p>
     <w:bookmarkStart w:id="20" w:name="what-insite-is-in-one-paragraph"/>
@@ -167,13 +167,13 @@
       </w:r>
     </w:p>
     <w:bookmarkEnd w:id="27"/>
-    <w:bookmarkStart w:id="28" w:name="what-it-is-not"/>
+    <w:bookmarkStart w:id="28" w:name="Xa128e18ed1649bf479fd87d3b4ec30a73ead9b0"/>
     <w:p>
       <w:pPr>
         <w:pStyle w:val="Heading2"/>
       </w:pPr>
       <w:r>
-        <w:t xml:space="preserve">9. What it is not</w:t>
+        <w:t xml:space="preserve">9. After closing: the annual levy, year after year</w:t>
       </w:r>
     </w:p>
     <w:p>
@@ -181,17 +181,35 @@
         <w:pStyle w:val="FirstParagraph"/>
       </w:pPr>
       <w:r>
+        <w:t xml:space="preserve">Ongoing administration asks almost nothing of you, and here is the whole machine. Each year the program administrator computes every parcel’s special tax under the recorded rate and method of apportionment and submits the levy file to the county; the county tax collector bills and collects it with the ordinary property tax bill, in the same installments, with the same enforcement standing (INS-501 sets the maker-and-checker recomputation discipline behind that annual file). While you hold unsold lots, the levy is yours and on-time payment matters twice: the lien carries the Act’s accelerated judicial foreclosure remedy on delinquency, applied per the note’s covenants, and your payment history is part of the program’s reported portfolio record. Once a home sells, the levy follows the land to the buyer, whose exposure is bounded by the recorded formula: an occupied home’s tax cannot rise more than 10 percent because of a neighbor’s delinquency (Government Code 53321(d)), and it can never be based on the home’s value (53325.3). Any owner, you included, can request a payoff quote at any time under the recorded prepayment right; the program administrator answers those quotes, levy questions, and everything else at the contact given at closing.</w:t>
+      </w:r>
+    </w:p>
+    <w:bookmarkEnd w:id="28"/>
+    <w:bookmarkStart w:id="29" w:name="what-it-is-not"/>
+    <w:p>
+      <w:pPr>
+        <w:pStyle w:val="Heading2"/>
+      </w:pPr>
+      <w:r>
+        <w:t xml:space="preserve">10. What it is not</w:t>
+      </w:r>
+    </w:p>
+    <w:p>
+      <w:pPr>
+        <w:pStyle w:val="FirstParagraph"/>
+      </w:pPr>
+      <w:r>
         <w:t xml:space="preserve">It is not free money: you still pay execution costs and the tax on lots you hold. It is not a personal loan: no personal guarantee, the security is the land. It is not available everywhere: your jurisdiction must have adopted the program and formed its master district first. And it is not final until a term sheet: every rate in marketing materials is a target.</w:t>
       </w:r>
     </w:p>
-    <w:bookmarkEnd w:id="28"/>
-    <w:bookmarkStart w:id="29" w:name="questions-developers-actually-ask"/>
+    <w:bookmarkEnd w:id="29"/>
+    <w:bookmarkStart w:id="30" w:name="questions-developers-actually-ask"/>
     <w:p>
       <w:pPr>
         <w:pStyle w:val="Heading2"/>
       </w:pPr>
       <w:r>
-        <w:t xml:space="preserve">10. Questions developers actually ask</w:t>
+        <w:t xml:space="preserve">11. Questions developers actually ask</w:t>
       </w:r>
     </w:p>
     <w:p>
@@ -336,8 +354,8 @@
         <w:t xml:space="preserve">INSITE(TM) is a pre-launch program concept administered by HGF Management Company. This material is not an offer of financing, legal advice, or investment advice. Program structure, eligibility, costs, and pricing are subject to issuer approval, bond counsel review, and program underwriting. Figures identified as targets or estimates are the founder’s working numbers, not commitments.</w:t>
       </w:r>
     </w:p>
-    <w:bookmarkEnd w:id="29"/>
     <w:bookmarkEnd w:id="30"/>
+    <w:bookmarkEnd w:id="31"/>
     <w:sectPr/>
   </w:body>
 </w:document>

</xml_diff>

<commit_message>
Dennis markup pass: INS-302 v1.2 (25% DTV, fee restructure, statute-verified annexation, plain-language What-it-is-not, three summary lines), INS-303 v1.1 (new 1.4 tax status), brief retitled with tax bullet; Counsel_Questions_2026-07-20 for Brad Neill; Build Log entry; rev 47
</commit_message>
<xml_diff>
--- a/02_PROGRAM/INS-302_Developer_Guide.docx
+++ b/02_PROGRAM/INS-302_Developer_Guide.docx
@@ -20,7 +20,7 @@
           <w:bCs/>
           <w:b/>
         </w:rPr>
-        <w:t xml:space="preserve">Version 1.1, July 18, 2026. One document for the builder: eligibility, the application, underwriting, approval, funding, construction, the annual levy, and the questions everyone asks. This guide consolidates the intake manual (INS-202), the data package checklist (INS-201), the appraisal manual (INS-101), and the transaction execution manual (INS-401); those remain the controlling documents where detail matters.</w:t>
+        <w:t xml:space="preserve">Version 1.2, July 20, 2026. One document for the builder: eligibility, the application, underwriting, approval, funding, construction, the annual levy, and the questions everyone asks. This guide consolidates the intake manual (INS-202), the data package checklist (INS-201), the appraisal manual (INS-101), and the transaction execution manual (INS-401); those remain the controlling documents where detail matters.</w:t>
       </w:r>
     </w:p>
     <w:bookmarkStart w:id="20" w:name="what-insite-is-in-one-paragraph"/>
@@ -37,7 +37,7 @@
         <w:pStyle w:val="FirstParagraph"/>
       </w:pPr>
       <w:r>
-        <w:t xml:space="preserve">INSITE finances development impact fees for small residential subdivisions, 2 to 50 lots, in participating California jurisdictions. Instead of writing a six-figure check at the permit counter or borrowing private money at 9.5 to 15 percent, the project’s fees are paid from a note secured by a voluntary special tax on the project’s own lots, collected with the property tax bill under the Mello-Roos Community Facilities Act (Government Code 53311 and following). Large master-planned communities have used this structure for decades; INSITE’s job is making it work at small-project scale.</w:t>
+        <w:t xml:space="preserve">INSITE finances development impact fees for small residential subdivisions, 2 to 50 lots, in participating California jurisdictions. Instead of writing a six-figure check at the permit counter or borrowing private money at 9.5 to 15 percent, the project’s fees are paid from a note secured by a voluntary special tax on the project’s own lots, collected with the property tax bill under the Mello-Roos Community Facilities Act (Government Code 53311 and following). Large master-planned communities have used this structure for decades; INSITE’s job is making it work at small-project scale. Three sentences carry the whole idea. It’s not a loan to you; it’s a tax on the land. You never repay the principal; the lots do. Your cash stays in your pocket at the permit counter.</w:t>
       </w:r>
     </w:p>
     <w:bookmarkEnd w:id="20"/>
@@ -55,7 +55,7 @@
         <w:pStyle w:val="FirstParagraph"/>
       </w:pPr>
       <w:r>
-        <w:t xml:space="preserve">Residential subdivisions of 2 to 50 lots in a participating jurisdiction; finished or near-finished lots; an appraised value of at least four times the financing (program policy, stricter than the statute’s three-to-one in Government Code 53345.8); and a minimum financing size set at feasibility screening. School fees are excluded at launch. Full eligibility rules live in INS-202.</w:t>
+        <w:t xml:space="preserve">Residential subdivisions of 2 to 50 lots in a participating jurisdiction; finished or near-finished lots; financing capped at 25 percent of the lots’ appraised value (program policy, stricter than the statute, which allows roughly a third, Government Code 53345.8); and a minimum financing size set at feasibility screening. School fees are excluded at launch. Full eligibility rules live in INS-202.</w:t>
       </w:r>
     </w:p>
     <w:bookmarkEnd w:id="21"/>
@@ -91,7 +91,7 @@
         <w:pStyle w:val="FirstParagraph"/>
       </w:pPr>
       <w:r>
-        <w:t xml:space="preserve">Two questions decide it. First, value: an independent MAI appraiser, engaged under the program’s appraisal manual (INS-101) to State Treasurer (CDIAC) standards, must find your lots worth at least four times the financing. Second, capacity: the total projected tax burden on a finished home is benchmarked against the two-percent-of-value policy used by the state’s largest issuer. If the numbers work, the deal proceeds; if they don’t, you hear it plainly and early, before you have spent meaningful money.</w:t>
+        <w:t xml:space="preserve">Two questions decide it. First, value: an independent MAI appraiser, engaged under the program’s appraisal manual (INS-101) to State Treasurer (CDIAC) standards, values your lots, and the financing is capped at 25 percent of that appraised value. Second, capacity: the total projected tax burden on a finished home is benchmarked against the two-percent-of-value policy used by the state’s largest issuer. If the numbers work, the deal proceeds; if they don’t, you hear it plainly and early, before you have spent meaningful money.</w:t>
       </w:r>
     </w:p>
     <w:bookmarkEnd w:id="23"/>
@@ -109,7 +109,7 @@
         <w:pStyle w:val="FirstParagraph"/>
       </w:pPr>
       <w:r>
-        <w:t xml:space="preserve">Participating jurisdictions maintain one master financing district with a recorded future annexation area. On undeveloped land the landowner is the elector, so your project joins by your written consent as landowner; there is no public election and no protest hearing, and the city council approves each annexation on its regular calendar (Government Code 53339.3(d) keeps each project’s security separate). Timing therefore depends on the council calendar, not on a campaign.</w:t>
+        <w:t xml:space="preserve">Participating jurisdictions maintain one master financing district with a recorded future annexation area. Under that recorded designation, your parcels join with the unanimous approval of the owner, your signature, without any requirement for further public hearings or additional proceedings (Government Code 53339.3(b) and 53339.7); the clerk simply records the annexation and the amendment to the notice of special tax lien, and Government Code 53339.3(d) keeps each project’s security separate. No hearing, no election, no campaign: paperwork and a recording.</w:t>
       </w:r>
     </w:p>
     <w:bookmarkEnd w:id="24"/>
@@ -127,7 +127,7 @@
         <w:pStyle w:val="FirstParagraph"/>
       </w:pPr>
       <w:r>
-        <w:t xml:space="preserve">At closing, note proceeds pay the eligible impact fees for your project. You pay the deal’s execution costs, targeted at $5,000 to $30,000 per project (a founder estimate, pending vendor quotes): appraisal, document preparation, title, recording, origination, and the annexation itself. Program fees are set at term sheet, not in marketing. The arithmetic of cash saved versus tax carried is in the calculator on the program website, insite-ca.org.</w:t>
+        <w:t xml:space="preserve">At closing, note proceeds pay the eligible impact fees for your project. You pay the deal’s costs in two parts: an origination fee set as a percentage of the amount financed, stated on your term sheet, plus the hard costs of execution, appraisal, document preparation, title, recording, and the annexation itself, targeted at $5,000 to $30,000 per project (a founder estimate, pending vendor quotes). The arithmetic of cash saved versus tax carried is in the calculator on the program website, insite-ca.org.</w:t>
       </w:r>
     </w:p>
     <w:bookmarkEnd w:id="25"/>
@@ -199,7 +199,7 @@
         <w:pStyle w:val="FirstParagraph"/>
       </w:pPr>
       <w:r>
-        <w:t xml:space="preserve">It is not free money: you still pay execution costs and the tax on lots you hold. It is not a personal loan: no personal guarantee, the security is the land. It is not available everywhere: your jurisdiction must have adopted the program and formed its master district first. And it is not final until a term sheet: every rate in marketing materials is a target.</w:t>
+        <w:t xml:space="preserve">This is not a loan to you. You never sign a personal guarantee, and nobody ever sends you a bill to pay the money back. Instead, each lot in your project picks up a small yearly charge on its property tax bill, and that charge is what pays the money back over time. When you sell a house, the charge goes with the house, and the buyer sees it on their tax bill like any other Mello-Roos tax; buyers get told about it in escrow, same as always. It is not free, though: you pay the costs of setting up the deal, things like the appraisal and paperwork, and any lot you still own pays its yearly charge until you sell it, the same way you pay property taxes on lots you hold. It does not work everywhere: your city or county has to be signed up with the program first. And no number is final until you have a signed term sheet in your hand; everything before that is an estimate.</w:t>
       </w:r>
     </w:p>
     <w:bookmarkEnd w:id="29"/>

</xml_diff>

<commit_message>
Founder decisions executed: Ch2 all-portal split (portal unlocked); capitalized deal costs, zero day-one cash, swept 6 surfaces w/ interactive proofs; 1-to-50 eligibility swept 8 documents + calculator minimums; 19% omitted per founder; INS-302 v1.3, INS-303 v1.3, INS-201 Form v1.1; 27 PDF pages + 6 pages x 2 widths verified; rev 63
</commit_message>
<xml_diff>
--- a/02_PROGRAM/INS-302_Developer_Guide.docx
+++ b/02_PROGRAM/INS-302_Developer_Guide.docx
@@ -20,7 +20,7 @@
           <w:bCs/>
           <w:b/>
         </w:rPr>
-        <w:t xml:space="preserve">Version 1.2, July 20, 2026. One document for the builder: eligibility, the application, underwriting, approval, funding, construction, the annual levy, and the questions everyone asks. This guide consolidates the intake manual (INS-202), the data package checklist (INS-201), the appraisal manual (INS-101), and the transaction execution manual (INS-401); those remain the controlling documents where detail matters.</w:t>
+        <w:t xml:space="preserve">Version 1.3, July 24, 2026. One document for the builder: eligibility, the application, underwriting, approval, funding, construction, the annual levy, and the questions everyone asks. This guide consolidates the intake manual (INS-202), the data package checklist (INS-201), the appraisal manual (INS-101), and the transaction execution manual (INS-401); those remain the controlling documents where detail matters.</w:t>
       </w:r>
     </w:p>
     <w:bookmarkStart w:id="20" w:name="what-insite-is-in-one-paragraph"/>
@@ -37,7 +37,7 @@
         <w:pStyle w:val="FirstParagraph"/>
       </w:pPr>
       <w:r>
-        <w:t xml:space="preserve">INSITE finances development impact fees for small residential subdivisions, 2 to 50 lots, in participating California jurisdictions. Instead of writing a six-figure check at the permit counter or borrowing private money at 9.5 to 15 percent, the project’s fees are paid from a note secured by a voluntary special tax on the project’s own lots, collected with the property tax bill under the Mello-Roos Community Facilities Act (Government Code 53311 and following). Large master-planned communities have used this structure for decades; INSITE’s job is making it work at small-project scale. Three sentences carry the whole idea. It’s not a loan to you; it’s a tax on the land. You never repay the principal; the lots do. Your cash stays in your pocket at the permit counter.</w:t>
+        <w:t xml:space="preserve">INSITE finances development impact fees for small residential subdivisions, 1 to 50 lots, in participating California jurisdictions. Instead of writing a six-figure check at the permit counter or borrowing private money at 9.5 to 15 percent, the project’s fees are paid from a note secured by a voluntary special tax on the project’s own lots, collected with the property tax bill under the Mello-Roos Community Facilities Act (Government Code 53311 and following). Large master-planned communities have used this structure for decades; INSITE’s job is making it work at small-project scale. Three sentences carry the whole idea. It’s not a loan to you; it’s a tax on the land. You never repay the principal; the lots do. Your cash stays in your pocket at the permit counter.</w:t>
       </w:r>
     </w:p>
     <w:bookmarkEnd w:id="20"/>
@@ -55,7 +55,7 @@
         <w:pStyle w:val="FirstParagraph"/>
       </w:pPr>
       <w:r>
-        <w:t xml:space="preserve">Residential subdivisions of 2 to 50 lots in a participating jurisdiction; finished or near-finished lots; financing capped at 25 percent of the lots’ appraised value (program policy, stricter than the statute, which allows roughly a third, Government Code 53345.8); and a minimum financing size set at feasibility screening. School fees are excluded at launch. Full eligibility rules live in INS-202.</w:t>
+        <w:t xml:space="preserve">Residential subdivisions of 1 to 50 lots in a participating jurisdiction; finished or near-finished lots; financing capped at 25 percent of the lots’ appraised value (program policy, stricter than the statute, which allows roughly a third, Government Code 53345.8); and a minimum financing size set at feasibility screening. School fees are excluded at launch. Full eligibility rules live in INS-202.</w:t>
       </w:r>
     </w:p>
     <w:bookmarkEnd w:id="21"/>
@@ -127,7 +127,7 @@
         <w:pStyle w:val="FirstParagraph"/>
       </w:pPr>
       <w:r>
-        <w:t xml:space="preserve">At closing, note proceeds pay the eligible impact fees for your project. You pay the deal’s costs in two parts: an origination fee set as a percentage of the amount financed, stated on your term sheet, plus the hard costs of execution, appraisal, document preparation, title, recording, and the annexation itself, targeted at $5,000 to $30,000 per project (a founder estimate, pending vendor quotes). The arithmetic of cash saved versus tax carried is in the calculator on the program website, insite-ca.org.</w:t>
+        <w:t xml:space="preserve">At closing, note proceeds pay the eligible impact fees for your project, and the deal’s costs are financed right alongside them, so your day-one cash is zero. Those costs come in two parts, both rolled into the note: an origination fee set as a percentage of the amount financed, stated on your term sheet, plus the hard costs of execution, appraisal, document preparation, title, recording, and the annexation itself, targeted at $5,000 to $30,000 per project (a founder estimate, pending vendor quotes). Financing the costs raises the annual special tax slightly, and the arithmetic shows it honestly. The arithmetic of cash saved versus tax carried is in the calculator on the program website, insite-ca.org.</w:t>
       </w:r>
     </w:p>
     <w:bookmarkEnd w:id="25"/>
@@ -199,7 +199,7 @@
         <w:pStyle w:val="FirstParagraph"/>
       </w:pPr>
       <w:r>
-        <w:t xml:space="preserve">This is not a loan to you. You never sign a personal guarantee, and nobody ever sends you a bill to pay the money back. Instead, each lot in your project picks up a small yearly charge on its property tax bill, and that charge is what pays the money back over time. When you sell a house, the charge goes with the house, and the buyer sees it on their tax bill like any other Mello-Roos tax; buyers get told about it in escrow, same as always. It is not free, though: you pay the costs of setting up the deal, things like the appraisal and paperwork, and any lot you still own pays its yearly charge until you sell it, the same way you pay property taxes on lots you hold. It does not work everywhere: your city or county has to be signed up with the program first. And no number is final until you have a signed term sheet in your hand; everything before that is an estimate.</w:t>
+        <w:t xml:space="preserve">This is not a loan to you. You never sign a personal guarantee, and nobody ever sends you a bill to pay the money back. Instead, each lot in your project picks up a small yearly charge on its property tax bill, and that charge is what pays the money back over time. When you sell a house, the charge goes with the house, and the buyer sees it on their tax bill like any other Mello-Roos tax; buyers get told about it in escrow, same as always. It is not free, though: the costs of setting up the deal, things like the appraisal and paperwork, are real and are financed into the note, which nudges the yearly charge up, and any lot you still own pays its yearly charge until you sell it, the same way you pay property taxes on lots you hold. It does not work everywhere: your city or county has to be signed up with the program first. And no number is final until you have a signed term sheet in your hand; everything before that is an estimate.</w:t>
       </w:r>
     </w:p>
     <w:bookmarkEnd w:id="29"/>
@@ -307,7 +307,7 @@
         <w:t xml:space="preserve"> </w:t>
       </w:r>
       <w:r>
-        <w:t xml:space="preserve">Outside the 2-to-50 launch box; ask anyway, the box is policy, not statute.</w:t>
+        <w:t xml:space="preserve">Outside the 1-to-50 launch box; ask anyway, the box is policy, not statute.</w:t>
       </w:r>
       <w:r>
         <w:t xml:space="preserve"> </w:t>

</xml_diff>